<commit_message>
Welt 4: Tracetabellen nur mit Variablen, Codestellen markiert
Folien 19/20, AB 2 (A7c, A9) + LSG, AB 3-LSG, Warm-up W4-09/10/12/13, Lab-Aufgaben und Boss.

Co-Authored-By: Claude Opus 5.5 <noreply@anthropic.com>
Claude-Session: https://claude.ai/code/session_01CemoEYGRdCe5FszEBVFFUP
</commit_message>
<xml_diff>
--- a/materialien/Welt4_Hafen/2_Arbeitsblaetter/AQ_W4_AB2_Unveraendert_und_DynArray.docx
+++ b/materialien/Welt4_Hafen/2_Arbeitsblaetter/AQ_W4_AB2_Unveraendert_und_DynArray.docx
@@ -11766,10 +11766,9 @@
         <w:tblLayout w:type="fixed"/>
       </w:tblPr>
       <w:tblGrid>
-        <w:gridCol w:w="1157"/>
-        <w:gridCol w:w="2699"/>
-        <w:gridCol w:w="2313"/>
-        <w:gridCol w:w="3469"/>
+        <w:gridCol w:w="1522"/>
+        <w:gridCol w:w="3551"/>
+        <w:gridCol w:w="4564"/>
       </w:tblGrid>
       <w:tr>
         <w:trPr>
@@ -11778,7 +11777,7 @@
         </w:trPr>
         <w:tc>
           <w:tcPr>
-            <w:tcW w:type="dxa" w:w="1157"/>
+            <w:tcW w:type="dxa" w:w="1522"/>
             <w:shd w:fill="1F4E79" w:color="auto" w:val="clear"/>
             <w:tcMar>
               <w:top w:type="dxa" w:w="50"/>
@@ -11809,7 +11808,7 @@
         </w:tc>
         <w:tc>
           <w:tcPr>
-            <w:tcW w:type="dxa" w:w="2699"/>
+            <w:tcW w:type="dxa" w:w="3551"/>
             <w:shd w:fill="1F4E79" w:color="auto" w:val="clear"/>
             <w:tcMar>
               <w:top w:type="dxa" w:w="50"/>
@@ -11840,38 +11839,7 @@
         </w:tc>
         <w:tc>
           <w:tcPr>
-            <w:tcW w:type="dxa" w:w="2313"/>
-            <w:shd w:fill="1F4E79" w:color="auto" w:val="clear"/>
-            <w:tcMar>
-              <w:top w:type="dxa" w:w="50"/>
-              <w:left w:type="dxa" w:w="100"/>
-              <w:bottom w:type="dxa" w:w="50"/>
-              <w:right w:type="dxa" w:w="100"/>
-            </w:tcMar>
-            <w:vAlign w:val="center"/>
-          </w:tcPr>
-          <w:p>
-            <w:pPr>
-              <w:keepNext/>
-              <w:spacing w:after="0" w:line="252"/>
-              <w:jc w:val="center"/>
-            </w:pPr>
-            <w:r>
-              <w:rPr>
-                <w:rFonts w:ascii="Calibri" w:cs="Calibri" w:eastAsia="Calibri" w:hAnsi="Calibri"/>
-                <w:b/>
-                <w:bCs/>
-                <w:color w:val="FFFFFF"/>
-                <w:sz w:val="19"/>
-                <w:szCs w:val="19"/>
-              </w:rPr>
-              <w:t xml:space="preserve">schwerer als 6 kg?</w:t>
-            </w:r>
-          </w:p>
-        </w:tc>
-        <w:tc>
-          <w:tcPr>
-            <w:tcW w:type="dxa" w:w="3469"/>
+            <w:tcW w:type="dxa" w:w="4564"/>
             <w:shd w:fill="1F4E79" w:color="auto" w:val="clear"/>
             <w:tcMar>
               <w:top w:type="dxa" w:w="50"/>
@@ -11908,64 +11876,45 @@
         </w:trPr>
         <w:tc>
           <w:tcPr>
-            <w:tcW w:type="dxa" w:w="1157"/>
-            <w:tcMar>
-              <w:top w:type="dxa" w:w="50"/>
-              <w:left w:type="dxa" w:w="100"/>
-              <w:bottom w:type="dxa" w:w="50"/>
-              <w:right w:type="dxa" w:w="100"/>
-            </w:tcMar>
-            <w:vAlign w:val="center"/>
-          </w:tcPr>
-          <w:p>
-            <w:pPr>
-              <w:keepNext/>
-              <w:spacing w:after="0" w:line="252"/>
-              <w:jc w:val="center"/>
-            </w:pPr>
-          </w:p>
-        </w:tc>
-        <w:tc>
-          <w:tcPr>
-            <w:tcW w:type="dxa" w:w="2699"/>
-            <w:tcMar>
-              <w:top w:type="dxa" w:w="50"/>
-              <w:left w:type="dxa" w:w="100"/>
-              <w:bottom w:type="dxa" w:w="50"/>
-              <w:right w:type="dxa" w:w="100"/>
-            </w:tcMar>
-            <w:vAlign w:val="center"/>
-          </w:tcPr>
-          <w:p>
-            <w:pPr>
-              <w:keepNext/>
-              <w:spacing w:after="0" w:line="252"/>
-              <w:jc w:val="center"/>
-            </w:pPr>
-          </w:p>
-        </w:tc>
-        <w:tc>
-          <w:tcPr>
-            <w:tcW w:type="dxa" w:w="2313"/>
-            <w:tcMar>
-              <w:top w:type="dxa" w:w="50"/>
-              <w:left w:type="dxa" w:w="100"/>
-              <w:bottom w:type="dxa" w:w="50"/>
-              <w:right w:type="dxa" w:w="100"/>
-            </w:tcMar>
-            <w:vAlign w:val="center"/>
-          </w:tcPr>
-          <w:p>
-            <w:pPr>
-              <w:keepNext/>
-              <w:spacing w:after="0" w:line="252"/>
-              <w:jc w:val="center"/>
-            </w:pPr>
-          </w:p>
-        </w:tc>
-        <w:tc>
-          <w:tcPr>
-            <w:tcW w:type="dxa" w:w="3469"/>
+            <w:tcW w:type="dxa" w:w="1522"/>
+            <w:tcMar>
+              <w:top w:type="dxa" w:w="50"/>
+              <w:left w:type="dxa" w:w="100"/>
+              <w:bottom w:type="dxa" w:w="50"/>
+              <w:right w:type="dxa" w:w="100"/>
+            </w:tcMar>
+            <w:vAlign w:val="center"/>
+          </w:tcPr>
+          <w:p>
+            <w:pPr>
+              <w:keepNext/>
+              <w:spacing w:after="0" w:line="252"/>
+              <w:jc w:val="center"/>
+            </w:pPr>
+          </w:p>
+        </w:tc>
+        <w:tc>
+          <w:tcPr>
+            <w:tcW w:type="dxa" w:w="3551"/>
+            <w:tcMar>
+              <w:top w:type="dxa" w:w="50"/>
+              <w:left w:type="dxa" w:w="100"/>
+              <w:bottom w:type="dxa" w:w="50"/>
+              <w:right w:type="dxa" w:w="100"/>
+            </w:tcMar>
+            <w:vAlign w:val="center"/>
+          </w:tcPr>
+          <w:p>
+            <w:pPr>
+              <w:keepNext/>
+              <w:spacing w:after="0" w:line="252"/>
+              <w:jc w:val="center"/>
+            </w:pPr>
+          </w:p>
+        </w:tc>
+        <w:tc>
+          <w:tcPr>
+            <w:tcW w:type="dxa" w:w="4564"/>
             <w:tcMar>
               <w:top w:type="dxa" w:w="50"/>
               <w:left w:type="dxa" w:w="100"/>
@@ -11990,64 +11939,45 @@
         </w:trPr>
         <w:tc>
           <w:tcPr>
-            <w:tcW w:type="dxa" w:w="1157"/>
-            <w:tcMar>
-              <w:top w:type="dxa" w:w="50"/>
-              <w:left w:type="dxa" w:w="100"/>
-              <w:bottom w:type="dxa" w:w="50"/>
-              <w:right w:type="dxa" w:w="100"/>
-            </w:tcMar>
-            <w:vAlign w:val="center"/>
-          </w:tcPr>
-          <w:p>
-            <w:pPr>
-              <w:keepNext/>
-              <w:spacing w:after="0" w:line="252"/>
-              <w:jc w:val="center"/>
-            </w:pPr>
-          </w:p>
-        </w:tc>
-        <w:tc>
-          <w:tcPr>
-            <w:tcW w:type="dxa" w:w="2699"/>
-            <w:tcMar>
-              <w:top w:type="dxa" w:w="50"/>
-              <w:left w:type="dxa" w:w="100"/>
-              <w:bottom w:type="dxa" w:w="50"/>
-              <w:right w:type="dxa" w:w="100"/>
-            </w:tcMar>
-            <w:vAlign w:val="center"/>
-          </w:tcPr>
-          <w:p>
-            <w:pPr>
-              <w:keepNext/>
-              <w:spacing w:after="0" w:line="252"/>
-              <w:jc w:val="center"/>
-            </w:pPr>
-          </w:p>
-        </w:tc>
-        <w:tc>
-          <w:tcPr>
-            <w:tcW w:type="dxa" w:w="2313"/>
-            <w:tcMar>
-              <w:top w:type="dxa" w:w="50"/>
-              <w:left w:type="dxa" w:w="100"/>
-              <w:bottom w:type="dxa" w:w="50"/>
-              <w:right w:type="dxa" w:w="100"/>
-            </w:tcMar>
-            <w:vAlign w:val="center"/>
-          </w:tcPr>
-          <w:p>
-            <w:pPr>
-              <w:keepNext/>
-              <w:spacing w:after="0" w:line="252"/>
-              <w:jc w:val="center"/>
-            </w:pPr>
-          </w:p>
-        </w:tc>
-        <w:tc>
-          <w:tcPr>
-            <w:tcW w:type="dxa" w:w="3469"/>
+            <w:tcW w:type="dxa" w:w="1522"/>
+            <w:tcMar>
+              <w:top w:type="dxa" w:w="50"/>
+              <w:left w:type="dxa" w:w="100"/>
+              <w:bottom w:type="dxa" w:w="50"/>
+              <w:right w:type="dxa" w:w="100"/>
+            </w:tcMar>
+            <w:vAlign w:val="center"/>
+          </w:tcPr>
+          <w:p>
+            <w:pPr>
+              <w:keepNext/>
+              <w:spacing w:after="0" w:line="252"/>
+              <w:jc w:val="center"/>
+            </w:pPr>
+          </w:p>
+        </w:tc>
+        <w:tc>
+          <w:tcPr>
+            <w:tcW w:type="dxa" w:w="3551"/>
+            <w:tcMar>
+              <w:top w:type="dxa" w:w="50"/>
+              <w:left w:type="dxa" w:w="100"/>
+              <w:bottom w:type="dxa" w:w="50"/>
+              <w:right w:type="dxa" w:w="100"/>
+            </w:tcMar>
+            <w:vAlign w:val="center"/>
+          </w:tcPr>
+          <w:p>
+            <w:pPr>
+              <w:keepNext/>
+              <w:spacing w:after="0" w:line="252"/>
+              <w:jc w:val="center"/>
+            </w:pPr>
+          </w:p>
+        </w:tc>
+        <w:tc>
+          <w:tcPr>
+            <w:tcW w:type="dxa" w:w="4564"/>
             <w:tcMar>
               <w:top w:type="dxa" w:w="50"/>
               <w:left w:type="dxa" w:w="100"/>
@@ -12072,64 +12002,45 @@
         </w:trPr>
         <w:tc>
           <w:tcPr>
-            <w:tcW w:type="dxa" w:w="1157"/>
-            <w:tcMar>
-              <w:top w:type="dxa" w:w="50"/>
-              <w:left w:type="dxa" w:w="100"/>
-              <w:bottom w:type="dxa" w:w="50"/>
-              <w:right w:type="dxa" w:w="100"/>
-            </w:tcMar>
-            <w:vAlign w:val="center"/>
-          </w:tcPr>
-          <w:p>
-            <w:pPr>
-              <w:keepNext/>
-              <w:spacing w:after="0" w:line="252"/>
-              <w:jc w:val="center"/>
-            </w:pPr>
-          </w:p>
-        </w:tc>
-        <w:tc>
-          <w:tcPr>
-            <w:tcW w:type="dxa" w:w="2699"/>
-            <w:tcMar>
-              <w:top w:type="dxa" w:w="50"/>
-              <w:left w:type="dxa" w:w="100"/>
-              <w:bottom w:type="dxa" w:w="50"/>
-              <w:right w:type="dxa" w:w="100"/>
-            </w:tcMar>
-            <w:vAlign w:val="center"/>
-          </w:tcPr>
-          <w:p>
-            <w:pPr>
-              <w:keepNext/>
-              <w:spacing w:after="0" w:line="252"/>
-              <w:jc w:val="center"/>
-            </w:pPr>
-          </w:p>
-        </w:tc>
-        <w:tc>
-          <w:tcPr>
-            <w:tcW w:type="dxa" w:w="2313"/>
-            <w:tcMar>
-              <w:top w:type="dxa" w:w="50"/>
-              <w:left w:type="dxa" w:w="100"/>
-              <w:bottom w:type="dxa" w:w="50"/>
-              <w:right w:type="dxa" w:w="100"/>
-            </w:tcMar>
-            <w:vAlign w:val="center"/>
-          </w:tcPr>
-          <w:p>
-            <w:pPr>
-              <w:keepNext/>
-              <w:spacing w:after="0" w:line="252"/>
-              <w:jc w:val="center"/>
-            </w:pPr>
-          </w:p>
-        </w:tc>
-        <w:tc>
-          <w:tcPr>
-            <w:tcW w:type="dxa" w:w="3469"/>
+            <w:tcW w:type="dxa" w:w="1522"/>
+            <w:tcMar>
+              <w:top w:type="dxa" w:w="50"/>
+              <w:left w:type="dxa" w:w="100"/>
+              <w:bottom w:type="dxa" w:w="50"/>
+              <w:right w:type="dxa" w:w="100"/>
+            </w:tcMar>
+            <w:vAlign w:val="center"/>
+          </w:tcPr>
+          <w:p>
+            <w:pPr>
+              <w:keepNext/>
+              <w:spacing w:after="0" w:line="252"/>
+              <w:jc w:val="center"/>
+            </w:pPr>
+          </w:p>
+        </w:tc>
+        <w:tc>
+          <w:tcPr>
+            <w:tcW w:type="dxa" w:w="3551"/>
+            <w:tcMar>
+              <w:top w:type="dxa" w:w="50"/>
+              <w:left w:type="dxa" w:w="100"/>
+              <w:bottom w:type="dxa" w:w="50"/>
+              <w:right w:type="dxa" w:w="100"/>
+            </w:tcMar>
+            <w:vAlign w:val="center"/>
+          </w:tcPr>
+          <w:p>
+            <w:pPr>
+              <w:keepNext/>
+              <w:spacing w:after="0" w:line="252"/>
+              <w:jc w:val="center"/>
+            </w:pPr>
+          </w:p>
+        </w:tc>
+        <w:tc>
+          <w:tcPr>
+            <w:tcW w:type="dxa" w:w="4564"/>
             <w:tcMar>
               <w:top w:type="dxa" w:w="50"/>
               <w:left w:type="dxa" w:w="100"/>
@@ -12154,64 +12065,45 @@
         </w:trPr>
         <w:tc>
           <w:tcPr>
-            <w:tcW w:type="dxa" w:w="1157"/>
-            <w:tcMar>
-              <w:top w:type="dxa" w:w="50"/>
-              <w:left w:type="dxa" w:w="100"/>
-              <w:bottom w:type="dxa" w:w="50"/>
-              <w:right w:type="dxa" w:w="100"/>
-            </w:tcMar>
-            <w:vAlign w:val="center"/>
-          </w:tcPr>
-          <w:p>
-            <w:pPr>
-              <w:keepNext/>
-              <w:spacing w:after="0" w:line="252"/>
-              <w:jc w:val="center"/>
-            </w:pPr>
-          </w:p>
-        </w:tc>
-        <w:tc>
-          <w:tcPr>
-            <w:tcW w:type="dxa" w:w="2699"/>
-            <w:tcMar>
-              <w:top w:type="dxa" w:w="50"/>
-              <w:left w:type="dxa" w:w="100"/>
-              <w:bottom w:type="dxa" w:w="50"/>
-              <w:right w:type="dxa" w:w="100"/>
-            </w:tcMar>
-            <w:vAlign w:val="center"/>
-          </w:tcPr>
-          <w:p>
-            <w:pPr>
-              <w:keepNext/>
-              <w:spacing w:after="0" w:line="252"/>
-              <w:jc w:val="center"/>
-            </w:pPr>
-          </w:p>
-        </w:tc>
-        <w:tc>
-          <w:tcPr>
-            <w:tcW w:type="dxa" w:w="2313"/>
-            <w:tcMar>
-              <w:top w:type="dxa" w:w="50"/>
-              <w:left w:type="dxa" w:w="100"/>
-              <w:bottom w:type="dxa" w:w="50"/>
-              <w:right w:type="dxa" w:w="100"/>
-            </w:tcMar>
-            <w:vAlign w:val="center"/>
-          </w:tcPr>
-          <w:p>
-            <w:pPr>
-              <w:keepNext/>
-              <w:spacing w:after="0" w:line="252"/>
-              <w:jc w:val="center"/>
-            </w:pPr>
-          </w:p>
-        </w:tc>
-        <w:tc>
-          <w:tcPr>
-            <w:tcW w:type="dxa" w:w="3469"/>
+            <w:tcW w:type="dxa" w:w="1522"/>
+            <w:tcMar>
+              <w:top w:type="dxa" w:w="50"/>
+              <w:left w:type="dxa" w:w="100"/>
+              <w:bottom w:type="dxa" w:w="50"/>
+              <w:right w:type="dxa" w:w="100"/>
+            </w:tcMar>
+            <w:vAlign w:val="center"/>
+          </w:tcPr>
+          <w:p>
+            <w:pPr>
+              <w:keepNext/>
+              <w:spacing w:after="0" w:line="252"/>
+              <w:jc w:val="center"/>
+            </w:pPr>
+          </w:p>
+        </w:tc>
+        <w:tc>
+          <w:tcPr>
+            <w:tcW w:type="dxa" w:w="3551"/>
+            <w:tcMar>
+              <w:top w:type="dxa" w:w="50"/>
+              <w:left w:type="dxa" w:w="100"/>
+              <w:bottom w:type="dxa" w:w="50"/>
+              <w:right w:type="dxa" w:w="100"/>
+            </w:tcMar>
+            <w:vAlign w:val="center"/>
+          </w:tcPr>
+          <w:p>
+            <w:pPr>
+              <w:keepNext/>
+              <w:spacing w:after="0" w:line="252"/>
+              <w:jc w:val="center"/>
+            </w:pPr>
+          </w:p>
+        </w:tc>
+        <w:tc>
+          <w:tcPr>
+            <w:tcW w:type="dxa" w:w="4564"/>
             <w:tcMar>
               <w:top w:type="dxa" w:w="50"/>
               <w:left w:type="dxa" w:w="100"/>
@@ -12236,7 +12128,7 @@
         </w:trPr>
         <w:tc>
           <w:tcPr>
-            <w:tcW w:type="dxa" w:w="1157"/>
+            <w:tcW w:type="dxa" w:w="1522"/>
             <w:tcMar>
               <w:top w:type="dxa" w:w="50"/>
               <w:left w:type="dxa" w:w="100"/>
@@ -12255,7 +12147,7 @@
         </w:tc>
         <w:tc>
           <w:tcPr>
-            <w:tcW w:type="dxa" w:w="2699"/>
+            <w:tcW w:type="dxa" w:w="3551"/>
             <w:tcMar>
               <w:top w:type="dxa" w:w="50"/>
               <w:left w:type="dxa" w:w="100"/>
@@ -12274,26 +12166,7 @@
         </w:tc>
         <w:tc>
           <w:tcPr>
-            <w:tcW w:type="dxa" w:w="2313"/>
-            <w:tcMar>
-              <w:top w:type="dxa" w:w="50"/>
-              <w:left w:type="dxa" w:w="100"/>
-              <w:bottom w:type="dxa" w:w="50"/>
-              <w:right w:type="dxa" w:w="100"/>
-            </w:tcMar>
-            <w:vAlign w:val="center"/>
-          </w:tcPr>
-          <w:p>
-            <w:pPr>
-              <w:keepNext w:val="false"/>
-              <w:spacing w:after="0" w:line="252"/>
-              <w:jc w:val="center"/>
-            </w:pPr>
-          </w:p>
-        </w:tc>
-        <w:tc>
-          <w:tcPr>
-            <w:tcW w:type="dxa" w:w="3469"/>
+            <w:tcW w:type="dxa" w:w="4564"/>
             <w:tcMar>
               <w:top w:type="dxa" w:w="50"/>
               <w:left w:type="dxa" w:w="100"/>
@@ -13508,6 +13381,15 @@
               </w:rPr>
               <w:t xml:space="preserve">        }</w:t>
             </w:r>
+            <w:r>
+              <w:rPr>
+                <w:rFonts w:ascii="Consolas" w:cs="Consolas" w:eastAsia="Consolas" w:hAnsi="Consolas"/>
+                <w:color w:val="5F7F5F"/>
+                <w:sz w:val="17"/>
+                <w:szCs w:val="17"/>
+              </w:rPr>
+              <w:t xml:space="preserve">   // → Tabellenzeile</w:t>
+            </w:r>
           </w:p>
           <w:p>
             <w:pPr>
@@ -13640,7 +13522,7 @@
                 <w:sz w:val="22"/>
                 <w:szCs w:val="22"/>
               </w:rPr>
-              <w:t xml:space="preserve">.</w:t>
+              <w:t xml:space="preserve">: eine Zeile an jeder mit „// → Tabellenzeile“ markierten Stelle.</w:t>
             </w:r>
           </w:p>
         </w:tc>

</xml_diff>